<commit_message>
contrato: rodapé com os dados oficiais (São Paulo), não os de Dracena do timbrado
O timbrado trazia Rua XV de Novembro, 743 — Dracena e dois telefones (18).
Fonte oficial = CONTACT do site (somatec_web/src/lib/constants/site.ts):
Av. Fagundes Filho, 141, Conjunto 72 — Vila Monte Alegre, São Paulo - SP,
04304-010 · +55 11 91764-4757 · comercial@.

A 1ª coluna cresceu (48,9 → 62 mm) pro endereço caber em 2 linhas; o site
segue em 151 mm. Conferido no Word → PDF. Teste trava Dracena/XV/98138/3823.

A razão social da assinatura ("Somatecblocking UF Eletroeletrônicos LTDA")
confere com o EMPRESA do site — não é erro de digitação.

Co-Authored-By: Claude Opus 5.5 <noreply@anthropic.com>
</commit_message>
<xml_diff>
--- a/backend/assets/contratos/proposta-contrato-anexo-i.docx
+++ b/backend/assets/contratos/proposta-contrato-anexo-i.docx
@@ -7115,14 +7115,14 @@
       <w:tblLook w:val="0000"/>
     </w:tblPr>
     <w:tblGrid>
-      <w:gridCol w:w="2772"/>
-      <w:gridCol w:w="3787"/>
+      <w:gridCol w:w="3515"/>
+      <w:gridCol w:w="3044"/>
       <w:gridCol w:w="2494"/>
     </w:tblGrid>
     <w:tr>
       <w:tc>
         <w:tcPr>
-          <w:tcW w:w="2772" w:type="dxa"/>
+          <w:tcW w:w="3515" w:type="dxa"/>
         </w:tcPr>
         <w:p>
           <w:pPr>
@@ -7135,7 +7135,7 @@
               <w:sz w:val="16"/>
               <w:szCs w:val="16"/>
             </w:rPr>
-            <w:t xml:space="preserve">Rua XV de Novembro, 743</w:t>
+            <w:t xml:space="preserve">Av. Fagundes Filho, 141, Conjunto 72</w:t>
           </w:r>
         </w:p>
         <w:p>
@@ -7149,13 +7149,13 @@
               <w:sz w:val="16"/>
               <w:szCs w:val="16"/>
             </w:rPr>
-            <w:t xml:space="preserve">Centro, Dracena - SP</w:t>
+            <w:t xml:space="preserve">Vila Monte Alegre, São Paulo - SP, 04304-010</w:t>
           </w:r>
         </w:p>
       </w:tc>
       <w:tc>
         <w:tcPr>
-          <w:tcW w:w="3787" w:type="dxa"/>
+          <w:tcW w:w="3044" w:type="dxa"/>
         </w:tcPr>
         <w:p>
           <w:pPr>
@@ -7168,7 +7168,7 @@
               <w:sz w:val="16"/>
               <w:szCs w:val="16"/>
             </w:rPr>
-            <w:t xml:space="preserve">+55 18 98138.5088  |  +55 18 3823.1562</w:t>
+            <w:t xml:space="preserve">+55 11 91764-4757</w:t>
           </w:r>
         </w:p>
         <w:p>

</xml_diff>

<commit_message>
Revert "fix(contrato): vigência, vencimento e carência saem da proposta, não fixos"
This reverts commit caf9a16833ac1e77a15c3bd87dcfd8408c6c4d27.
</commit_message>
<xml_diff>
--- a/backend/assets/contratos/proposta-contrato-anexo-i.docx
+++ b/backend/assets/contratos/proposta-contrato-anexo-i.docx
@@ -4690,7 +4690,7 @@
                 <w:sz w:val="28"/>
                 <w:szCs w:val="28"/>
               </w:rPr>
-              <w:t>Locação Mensal (vigência de {{vigencia_meses}} meses)</w:t>
+              <w:t>Locação Mensal (vigência de 60 meses)</w:t>
             </w:r>
           </w:p>
         </w:tc>
@@ -5542,7 +5542,7 @@
           <w:rFonts w:ascii="Source Sans Pro Light" w:hAnsi="Source Sans Pro Light" w:cs="Arial"/>
           <w:color w:val="767171" w:themeColor="background2" w:themeShade="80"/>
         </w:rPr>
-        <w:t xml:space="preserve">, iniciando-se no dia {{dia_vencimento}}, ou no dia útil imediatamente subsequente, do {{carencia_mes_inicio}} mês subsequente àquele em que estiver compreendida </w:t>
+        <w:t xml:space="preserve">, iniciando-se no dia 05 (cinco), ou no dia útil imediatamente subsequente, do segundo mês subsequente àquele em que estiver compreendida </w:t>
       </w:r>
       <w:r>
         <w:rPr>
@@ -5550,7 +5550,7 @@
           <w:color w:val="767171" w:themeColor="background2" w:themeShade="80"/>
         </w:rPr>
         <w:lastRenderedPageBreak/>
-        <w:t>a data de término da instalação, vencendo-se todos os demais no dia {{dia_vencimento}}, ou no dia útil imediatamente subsequente, dos meses que se seguirem, nos termos da Cláusula Sétima do Contrato.</w:t>
+        <w:t>a data de término da instalação, vencendo-se todos os demais no dia 05 (cinco), ou no dia útil imediatamente subsequente, dos meses que se seguirem, nos termos da Cláusula Sétima do Contrato.</w:t>
       </w:r>
     </w:p>
     <w:p>
@@ -5577,7 +5577,7 @@
           <w:rFonts w:ascii="Source Sans Pro Light" w:hAnsi="Source Sans Pro Light" w:cs="Arial"/>
           <w:color w:val="767171" w:themeColor="background2" w:themeShade="80"/>
         </w:rPr>
-        <w:t>: o vínculo contratual de locação mensal terá vigência mínima de {{vigencia_meses}} meses, não podendo ser rescindido por denúncia vazia antes deste prazo.</w:t>
+        <w:t>: o vínculo contratual de locação mensal terá vigência mínima de 60 (sessenta) meses, não podendo ser rescindido por denúncia vazia antes deste prazo.</w:t>
       </w:r>
     </w:p>
     <w:p>
@@ -5622,7 +5622,7 @@
           <w:rFonts w:ascii="Source Sans Pro Light" w:hAnsi="Source Sans Pro Light" w:cs="Arial"/>
           <w:color w:val="767171" w:themeColor="background2" w:themeShade="80"/>
         </w:rPr>
-        <w:t xml:space="preserve"> avaliará a eficiência do Sistema Master Block IoT. No 13º (décimo terceiro) mês, considerando-se insatisfeita com os resultados, poderá rescindir o vínculo contratual sem justa causa, devendo, para tanto, manifestar-se expressamente e por escrito até o dia {{dia_vencimento}} do 13º (décimo terceiro) mês. O silêncio quanto à rescisão e o prosseguimento do pagamento dos aluguéis serão considerados, para todos os fins, como aceitação do contrato, convalidando-se o vínculo pelo período remanescente de {{periodo_remanescente}} meses, nos termos da Cláusula Sexta do Contrato.</w:t>
+        <w:t xml:space="preserve"> avaliará a eficiência do Sistema Master Block IoT. No 13º (décimo terceiro) mês, considerando-se insatisfeita com os resultados, poderá rescindir o vínculo contratual sem justa causa, devendo, para tanto, manifestar-se expressamente e por escrito até o dia 05 (cinco) do 13º (décimo terceiro) mês. O silêncio quanto à rescisão e o prosseguimento do pagamento dos aluguéis serão considerados, para todos os fins, como aceitação do contrato, convalidando-se o vínculo pelo período remanescente de 48 (quarenta e oito) meses, nos termos da Cláusula Sexta do Contrato.</w:t>
       </w:r>
     </w:p>
     <w:p>

</xml_diff>

<commit_message>
fix(contrato): tabela do item 06 — ITEM e MODELO não quebram, sem linha vazia no fim
Léo (25/09), lendo o contrato da PROP-0029 em PDF: "ITE/M" e "MODEL/O"
partidos no cabeçalho e uma linha escura vazia sobrando depois dos quadros.
No modelo padrão (assets/contratos): ITEM 811→1000 e MODELO 1271→1500
twips, tirados de QUADRO/PAINEL, V e IoT (largura total igual, 9639); a 3ª
linha (vazia, sem texto) sai. Teste trava as duas coisas no modelo real.

Co-Authored-By: Claude Opus 5.5 <noreply@anthropic.com>
</commit_message>
<xml_diff>
--- a/backend/assets/contratos/proposta-contrato-anexo-i.docx
+++ b/backend/assets/contratos/proposta-contrato-anexo-i.docx
@@ -3510,13 +3510,13 @@
         <w:tblLook w:val="04A0" w:firstRow="1" w:lastRow="0" w:firstColumn="1" w:lastColumn="0" w:noHBand="0" w:noVBand="1"/>
       </w:tblPr>
       <w:tblGrid>
-        <w:gridCol w:w="811"/>
+        <w:gridCol w:w="1000"/>
         <w:gridCol w:w="1249"/>
-        <w:gridCol w:w="3185"/>
-        <w:gridCol w:w="992"/>
-        <w:gridCol w:w="1151"/>
-        <w:gridCol w:w="1271"/>
-        <w:gridCol w:w="980"/>
+        <w:gridCol w:w="3040"/>
+        <w:gridCol w:w="1000"/>
+        <w:gridCol w:w="1000"/>
+        <w:gridCol w:w="1500"/>
+        <w:gridCol w:w="850"/>
       </w:tblGrid>
       <w:tr>
         <w:trPr>
@@ -3525,7 +3525,7 @@
         <w:tc>
           <w:tcPr>
             <w:cnfStyle w:val="001000000000" w:firstRow="0" w:lastRow="0" w:firstColumn="1" w:lastColumn="0" w:oddVBand="0" w:evenVBand="0" w:oddHBand="0" w:evenHBand="0" w:firstRowFirstColumn="0" w:firstRowLastColumn="0" w:lastRowFirstColumn="0" w:lastRowLastColumn="0"/>
-            <w:tcW w:w="811" w:type="dxa"/>
+            <w:tcW w:w="1000" w:type="dxa"/>
             <w:shd w:val="clear" w:color="auto" w:fill="13486F"/>
           </w:tcPr>
           <w:p>
@@ -3551,7 +3551,7 @@
         </w:tc>
         <w:tc>
           <w:tcPr>
-            <w:tcW w:w="4434" w:type="dxa"/>
+            <w:tcW w:w="4289" w:type="dxa"/>
             <w:gridSpan w:val="2"/>
             <w:shd w:val="clear" w:color="auto" w:fill="13486F"/>
             <w:vAlign w:val="center"/>
@@ -3579,7 +3579,7 @@
         </w:tc>
         <w:tc>
           <w:tcPr>
-            <w:tcW w:w="992" w:type="dxa"/>
+            <w:tcW w:w="1000" w:type="dxa"/>
             <w:shd w:val="clear" w:color="auto" w:fill="13486F"/>
             <w:vAlign w:val="center"/>
           </w:tcPr>
@@ -3606,7 +3606,7 @@
         </w:tc>
         <w:tc>
           <w:tcPr>
-            <w:tcW w:w="1151" w:type="dxa"/>
+            <w:tcW w:w="1000" w:type="dxa"/>
             <w:shd w:val="clear" w:color="auto" w:fill="13486F"/>
             <w:vAlign w:val="center"/>
           </w:tcPr>
@@ -3633,7 +3633,7 @@
         </w:tc>
         <w:tc>
           <w:tcPr>
-            <w:tcW w:w="1271" w:type="dxa"/>
+            <w:tcW w:w="1500" w:type="dxa"/>
             <w:shd w:val="clear" w:color="auto" w:fill="13486F"/>
             <w:vAlign w:val="center"/>
           </w:tcPr>
@@ -3660,7 +3660,7 @@
         </w:tc>
         <w:tc>
           <w:tcPr>
-            <w:tcW w:w="980" w:type="dxa"/>
+            <w:tcW w:w="850" w:type="dxa"/>
             <w:shd w:val="clear" w:color="auto" w:fill="13486F"/>
           </w:tcPr>
           <w:p>
@@ -3692,7 +3692,7 @@
         <w:tc>
           <w:tcPr>
             <w:cnfStyle w:val="001000000000" w:firstRow="0" w:lastRow="0" w:firstColumn="1" w:lastColumn="0" w:oddVBand="0" w:evenVBand="0" w:oddHBand="0" w:evenHBand="0" w:firstRowFirstColumn="0" w:firstRowLastColumn="0" w:lastRowFirstColumn="0" w:lastRowLastColumn="0"/>
-            <w:tcW w:w="811" w:type="dxa"/>
+            <w:tcW w:w="1000" w:type="dxa"/>
             <w:vAlign w:val="bottom"/>
           </w:tcPr>
           <w:p>
@@ -3721,7 +3721,7 @@
         </w:tc>
         <w:tc>
           <w:tcPr>
-            <w:tcW w:w="4434" w:type="dxa"/>
+            <w:tcW w:w="4289" w:type="dxa"/>
             <w:gridSpan w:val="2"/>
             <w:vAlign w:val="bottom"/>
           </w:tcPr>
@@ -3792,7 +3792,7 @@
         </w:tc>
         <w:tc>
           <w:tcPr>
-            <w:tcW w:w="992" w:type="dxa"/>
+            <w:tcW w:w="1000" w:type="dxa"/>
           </w:tcPr>
           <w:p>
             <w:pPr>
@@ -3839,7 +3839,7 @@
         </w:tc>
         <w:tc>
           <w:tcPr>
-            <w:tcW w:w="1151" w:type="dxa"/>
+            <w:tcW w:w="1000" w:type="dxa"/>
             <w:vAlign w:val="bottom"/>
           </w:tcPr>
           <w:p>
@@ -3887,7 +3887,7 @@
         </w:tc>
         <w:tc>
           <w:tcPr>
-            <w:tcW w:w="1271" w:type="dxa"/>
+            <w:tcW w:w="1500" w:type="dxa"/>
             <w:vAlign w:val="bottom"/>
           </w:tcPr>
           <w:p>
@@ -3924,7 +3924,7 @@
         </w:tc>
         <w:tc>
           <w:tcPr>
-            <w:tcW w:w="980" w:type="dxa"/>
+            <w:tcW w:w="850" w:type="dxa"/>
           </w:tcPr>
           <w:p>
             <w:pPr>
@@ -3947,81 +3947,6 @@
               </w:rPr>
               <w:t>{{iot}}{{/quadros}}</w:t>
             </w:r>
-          </w:p>
-        </w:tc>
-      </w:tr>
-      <w:tr>
-        <w:tc>
-          <w:tcPr>
-            <w:cnfStyle w:val="001000000000" w:firstRow="0" w:lastRow="0" w:firstColumn="1" w:lastColumn="0" w:oddVBand="0" w:evenVBand="0" w:oddHBand="0" w:evenHBand="0" w:firstRowFirstColumn="0" w:firstRowLastColumn="0" w:lastRowFirstColumn="0" w:lastRowLastColumn="0"/>
-            <w:tcW w:w="811" w:type="dxa"/>
-            <w:shd w:val="clear" w:color="auto" w:fill="13486F"/>
-          </w:tcPr>
-          <w:p>
-            <w:pPr>
-              <w:spacing w:line="276" w:lineRule="auto"/>
-              <w:jc w:val="both"/>
-              <w:rPr>
-                <w:rFonts w:ascii="Brandon Grotesque Bold" w:hAnsi="Brandon Grotesque Bold" w:cs="Arial"/>
-                <w:b w:val="0"/>
-                <w:bCs w:val="0"/>
-              </w:rPr>
-            </w:pPr>
-          </w:p>
-        </w:tc>
-        <w:tc>
-          <w:tcPr>
-            <w:tcW w:w="1249" w:type="dxa"/>
-            <w:shd w:val="clear" w:color="auto" w:fill="13486F"/>
-          </w:tcPr>
-          <w:p>
-            <w:pPr>
-              <w:spacing w:line="276" w:lineRule="auto"/>
-              <w:jc w:val="both"/>
-              <w:cnfStyle w:val="000000000000" w:firstRow="0" w:lastRow="0" w:firstColumn="0" w:lastColumn="0" w:oddVBand="0" w:evenVBand="0" w:oddHBand="0" w:evenHBand="0" w:firstRowFirstColumn="0" w:firstRowLastColumn="0" w:lastRowFirstColumn="0" w:lastRowLastColumn="0"/>
-              <w:rPr>
-                <w:rFonts w:ascii="Brandon Grotesque Bold" w:hAnsi="Brandon Grotesque Bold" w:cs="Arial"/>
-                <w:b/>
-                <w:bCs/>
-              </w:rPr>
-            </w:pPr>
-          </w:p>
-        </w:tc>
-        <w:tc>
-          <w:tcPr>
-            <w:tcW w:w="6599" w:type="dxa"/>
-            <w:gridSpan w:val="4"/>
-            <w:shd w:val="clear" w:color="auto" w:fill="13486F"/>
-          </w:tcPr>
-          <w:p>
-            <w:pPr>
-              <w:spacing w:line="276" w:lineRule="auto"/>
-              <w:jc w:val="both"/>
-              <w:cnfStyle w:val="000000000000" w:firstRow="0" w:lastRow="0" w:firstColumn="0" w:lastColumn="0" w:oddVBand="0" w:evenVBand="0" w:oddHBand="0" w:evenHBand="0" w:firstRowFirstColumn="0" w:firstRowLastColumn="0" w:lastRowFirstColumn="0" w:lastRowLastColumn="0"/>
-              <w:rPr>
-                <w:rFonts w:ascii="Brandon Grotesque Bold" w:hAnsi="Brandon Grotesque Bold" w:cs="Arial"/>
-                <w:b/>
-                <w:bCs/>
-              </w:rPr>
-            </w:pPr>
-          </w:p>
-        </w:tc>
-        <w:tc>
-          <w:tcPr>
-            <w:tcW w:w="980" w:type="dxa"/>
-            <w:shd w:val="clear" w:color="auto" w:fill="13486F"/>
-          </w:tcPr>
-          <w:p>
-            <w:pPr>
-              <w:spacing w:line="276" w:lineRule="auto"/>
-              <w:jc w:val="both"/>
-              <w:cnfStyle w:val="000000000000" w:firstRow="0" w:lastRow="0" w:firstColumn="0" w:lastColumn="0" w:oddVBand="0" w:evenVBand="0" w:oddHBand="0" w:evenHBand="0" w:firstRowFirstColumn="0" w:firstRowLastColumn="0" w:lastRowFirstColumn="0" w:lastRowLastColumn="0"/>
-              <w:rPr>
-                <w:rFonts w:ascii="Brandon Grotesque Bold" w:hAnsi="Brandon Grotesque Bold" w:cs="Arial"/>
-                <w:b/>
-                <w:bCs/>
-              </w:rPr>
-            </w:pPr>
           </w:p>
         </w:tc>
       </w:tr>

</xml_diff>